<commit_message>
Corrigidos tópicos e suas respectivas páginas
</commit_message>
<xml_diff>
--- a/private/documentacao/TI-Documentacao-InvTracker-Grupo1.docx
+++ b/private/documentacao/TI-Documentacao-InvTracker-Grupo1.docx
@@ -507,7 +507,7 @@
     <w:sdt>
       <w:sdtPr>
         <w:rPr>
-          <w:rFonts w:ascii="Arial MT" w:eastAsia="Arial MT" w:hAnsi="Arial MT"/>
+          <w:rFonts w:ascii="Arial MT" w:eastAsia="Arial MT" w:hAnsi="Arial MT" w:cs="Arial MT"/>
           <w:b w:val="0"/>
           <w:bCs w:val="0"/>
           <w:sz w:val="24"/>
@@ -836,7 +836,15 @@
                 <w:sz w:val="24"/>
                 <w:szCs w:val="24"/>
               </w:rPr>
-              <w:t>Do</w:t>
+              <w:t>d</w:t>
+            </w:r>
+            <w:r>
+              <w:rPr>
+                <w:rFonts w:cs="Arial"/>
+                <w:sz w:val="24"/>
+                <w:szCs w:val="24"/>
+              </w:rPr>
+              <w:t>o</w:t>
             </w:r>
             <w:r>
               <w:rPr>
@@ -981,7 +989,15 @@
                 <w:sz w:val="24"/>
                 <w:szCs w:val="24"/>
               </w:rPr>
-              <w:t>Do</w:t>
+              <w:t>d</w:t>
+            </w:r>
+            <w:r>
+              <w:rPr>
+                <w:rFonts w:cs="Arial"/>
+                <w:sz w:val="24"/>
+                <w:szCs w:val="24"/>
+              </w:rPr>
+              <w:t>o</w:t>
             </w:r>
             <w:r>
               <w:rPr>
@@ -1019,6 +1035,49 @@
               <w:t>7</w:t>
             </w:r>
           </w:hyperlink>
+        </w:p>
+        <w:p>
+          <w:pPr>
+            <w:pStyle w:val="Sumrio2"/>
+            <w:numPr>
+              <w:ilvl w:val="1"/>
+              <w:numId w:val="4"/>
+            </w:numPr>
+            <w:tabs>
+              <w:tab w:val="left" w:pos="1941"/>
+              <w:tab w:val="right" w:leader="dot" w:pos="9661"/>
+            </w:tabs>
+            <w:ind w:left="1941" w:hanging="751"/>
+            <w:rPr>
+              <w:rFonts w:cs="Arial"/>
+              <w:sz w:val="24"/>
+              <w:szCs w:val="24"/>
+            </w:rPr>
+          </w:pPr>
+          <w:r>
+            <w:rPr>
+              <w:rFonts w:cs="Arial"/>
+              <w:sz w:val="24"/>
+              <w:szCs w:val="24"/>
+            </w:rPr>
+            <w:t>Ferramentas do Projeto</w:t>
+          </w:r>
+          <w:r>
+            <w:rPr>
+              <w:rFonts w:cs="Arial"/>
+              <w:sz w:val="24"/>
+              <w:szCs w:val="24"/>
+            </w:rPr>
+            <w:tab/>
+          </w:r>
+          <w:r>
+            <w:rPr>
+              <w:rFonts w:cs="Arial"/>
+              <w:sz w:val="24"/>
+              <w:szCs w:val="24"/>
+            </w:rPr>
+            <w:t>8</w:t>
+          </w:r>
         </w:p>
         <w:p>
           <w:pPr>
@@ -1098,7 +1157,7 @@
                 <w:sz w:val="24"/>
                 <w:szCs w:val="24"/>
               </w:rPr>
-              <w:t>9</w:t>
+              <w:t>17</w:t>
             </w:r>
           </w:hyperlink>
         </w:p>
@@ -1163,7 +1222,7 @@
                 <w:sz w:val="24"/>
                 <w:szCs w:val="24"/>
               </w:rPr>
-              <w:t>10</w:t>
+              <w:t>18</w:t>
             </w:r>
           </w:hyperlink>
         </w:p>
@@ -1227,7 +1286,7 @@
                 <w:sz w:val="24"/>
                 <w:szCs w:val="24"/>
               </w:rPr>
-              <w:t>11</w:t>
+              <w:t>19</w:t>
             </w:r>
           </w:hyperlink>
         </w:p>
@@ -1299,9 +1358,18 @@
                 <w:sz w:val="24"/>
                 <w:szCs w:val="24"/>
               </w:rPr>
-              <w:t>12</w:t>
+              <w:t>2</w:t>
             </w:r>
           </w:hyperlink>
+          <w:r>
+            <w:rPr>
+              <w:rFonts w:cs="Arial"/>
+              <w:spacing w:val="-5"/>
+              <w:sz w:val="24"/>
+              <w:szCs w:val="24"/>
+            </w:rPr>
+            <w:t>0</w:t>
+          </w:r>
         </w:p>
         <w:p>
           <w:pPr>
@@ -1347,7 +1415,7 @@
                 <w:sz w:val="24"/>
                 <w:szCs w:val="24"/>
               </w:rPr>
-              <w:t>13</w:t>
+              <w:t>21</w:t>
             </w:r>
           </w:hyperlink>
         </w:p>
@@ -1429,7 +1497,7 @@
                 <w:sz w:val="24"/>
                 <w:szCs w:val="24"/>
               </w:rPr>
-              <w:t>14</w:t>
+              <w:t>22</w:t>
             </w:r>
           </w:hyperlink>
         </w:p>
@@ -1510,7 +1578,7 @@
                 <w:sz w:val="24"/>
                 <w:szCs w:val="24"/>
               </w:rPr>
-              <w:t>14</w:t>
+              <w:t>22</w:t>
             </w:r>
           </w:hyperlink>
         </w:p>
@@ -1548,20 +1616,10 @@
             <w:r>
               <w:rPr>
                 <w:rFonts w:ascii="Arial MT" w:hAnsi="Arial MT"/>
-                <w:spacing w:val="-10"/>
-                <w:sz w:val="24"/>
-                <w:szCs w:val="24"/>
-              </w:rPr>
-              <w:t xml:space="preserve"> </w:t>
-            </w:r>
-            <w:r>
-              <w:rPr>
-                <w:rFonts w:ascii="Arial MT" w:hAnsi="Arial MT"/>
-                <w:spacing w:val="-2"/>
-                <w:sz w:val="24"/>
-                <w:szCs w:val="24"/>
-              </w:rPr>
-              <w:t>BIBLIOGRÁFICA</w:t>
+                <w:sz w:val="24"/>
+                <w:szCs w:val="24"/>
+              </w:rPr>
+              <w:t>S</w:t>
             </w:r>
             <w:r>
               <w:rPr>
@@ -1578,7 +1636,7 @@
                 <w:sz w:val="24"/>
                 <w:szCs w:val="24"/>
               </w:rPr>
-              <w:t>15</w:t>
+              <w:t>23</w:t>
             </w:r>
           </w:hyperlink>
         </w:p>
@@ -1650,13 +1708,7 @@
             <w:rPr>
               <w:rFonts w:cs="Arial"/>
             </w:rPr>
-            <w:t xml:space="preserve">Criado na Alemanha no começo da segunda metade do século XX, o </w:t>
-          </w:r>
-          <w:r>
-            <w:rPr>
-              <w:rFonts w:cs="Arial"/>
-            </w:rPr>
-            <w:t>modelo híbrido de comércio, que une características tanto do atacado, quanto do varejo,</w:t>
+            <w:t>Criado na Alemanha no começo da segunda metade do século XX, o modelo híbrido de comércio, que une características tanto do atacado, quanto do varejo,</w:t>
           </w:r>
           <w:r>
             <w:rPr>
@@ -1682,13 +1734,7 @@
             <w:rPr>
               <w:rFonts w:cs="Arial"/>
             </w:rPr>
-            <w:t>. Com o intuito de acabar com a necessidade de um revendedor, essa modalida</w:t>
-          </w:r>
-          <w:r>
-            <w:rPr>
-              <w:rFonts w:cs="Arial"/>
-            </w:rPr>
-            <w:t>de, comumente chamada de atacarejo, consegue, além de apresentar preços menores, atender um público maior, seja vendendo para o consumidor final ou para pequenos comércios (</w:t>
+            <w:t>. Com o intuito de acabar com a necessidade de um revendedor, essa modalidade, comumente chamada de atacarejo, consegue, além de apresentar preços menores, atender um público maior, seja vendendo para o consumidor final ou para pequenos comércios (</w:t>
           </w:r>
           <w:r>
             <w:rPr>
@@ -1718,13 +1764,7 @@
             <w:rPr>
               <w:rFonts w:cs="Arial"/>
             </w:rPr>
-            <w:t>Dessa forma, o crescimento desse setor tem se intensificado ca</w:t>
-          </w:r>
-          <w:r>
-            <w:rPr>
-              <w:rFonts w:cs="Arial"/>
-            </w:rPr>
-            <w:t>da vez mais, se colocando, atualmente, como o maior canal de varejo alimentar do país (</w:t>
+            <w:t>Dessa forma, o crescimento desse setor tem se intensificado cada vez mais, se colocando, atualmente, como o maior canal de varejo alimentar do país (</w:t>
           </w:r>
           <w:r>
             <w:rPr>
@@ -1750,13 +1790,7 @@
             <w:rPr>
               <w:rFonts w:cs="Arial"/>
             </w:rPr>
-            <w:t>em 20</w:t>
-          </w:r>
-          <w:r>
-            <w:rPr>
-              <w:rFonts w:cs="Arial"/>
-            </w:rPr>
-            <w:t>24, o atacarejo foi responsável por R$ 340 bilhões de faturamento (</w:t>
+            <w:t>em 2024, o atacarejo foi responsável por R$ 340 bilhões de faturamento (</w:t>
           </w:r>
           <w:r>
             <w:rPr>
@@ -1936,14 +1970,7 @@
               <w:rFonts w:cs="Arial"/>
               <w:color w:val="212121"/>
             </w:rPr>
-            <w:t>NIEL</w:t>
-          </w:r>
-          <w:r>
-            <w:rPr>
-              <w:rFonts w:cs="Arial"/>
-              <w:color w:val="212121"/>
-            </w:rPr>
-            <w:t>SEN CONSUMER LLC, 2025)</w:t>
+            <w:t>NIELSEN CONSUMER LLC, 2025)</w:t>
           </w:r>
           <w:r>
             <w:rPr>
@@ -2353,13 +2380,7 @@
               <w:rFonts w:cs="Arial"/>
             </w:rPr>
             <w:lastRenderedPageBreak/>
-            <w:t xml:space="preserve">Entretanto, mesmo com a melhora na receita, as empresas vêm encontrando dificuldade na manutenção e </w:t>
-          </w:r>
-          <w:r>
-            <w:rPr>
-              <w:rFonts w:cs="Arial"/>
-            </w:rPr>
-            <w:t>gestão dos seus produtos, apresentando uma crescente nas perdas de estoque (</w:t>
+            <w:t>Entretanto, mesmo com a melhora na receita, as empresas vêm encontrando dificuldade na manutenção e gestão dos seus produtos, apresentando uma crescente nas perdas de estoque (</w:t>
           </w:r>
           <w:r>
             <w:rPr>
@@ -2372,13 +2393,7 @@
             <w:rPr>
               <w:rFonts w:cs="Arial"/>
             </w:rPr>
-            <w:t>. De acordo com levantamento realizado pela Associação Brasileira de Prevenção de Perdas (Abrappe), houve, também em 2024, um aumento de 10% nos prejuízos em relaçã</w:t>
-          </w:r>
-          <w:r>
-            <w:rPr>
-              <w:rFonts w:cs="Arial"/>
-            </w:rPr>
-            <w:t>o à situação do ano anterior no</w:t>
+            <w:t>. De acordo com levantamento realizado pela Associação Brasileira de Prevenção de Perdas (Abrappe), houve, também em 2024, um aumento de 10% nos prejuízos em relação à situação do ano anterior no</w:t>
           </w:r>
           <w:r>
             <w:rPr>
@@ -2444,19 +2459,7 @@
             <w:rPr>
               <w:rFonts w:cs="Arial"/>
             </w:rPr>
-            <w:t>Nesse cenário, medidas para minimizar esse problema vêm send</w:t>
-          </w:r>
-          <w:r>
-            <w:rPr>
-              <w:rFonts w:cs="Arial"/>
-            </w:rPr>
-            <w:t>o amplamente requisitadas e implementadas por inúmeras empresas. Nos últimos anos, uma das soluções mais utilizadas por atacadistas de autosserviço são os sistemas ERP, uma ferramenta que centraliza e integra diversos processos de gestão financeira e opera</w:t>
-          </w:r>
-          <w:r>
-            <w:rPr>
-              <w:rFonts w:cs="Arial"/>
-            </w:rPr>
-            <w:t>cional (</w:t>
+            <w:t>Nesse cenário, medidas para minimizar esse problema vêm sendo amplamente requisitadas e implementadas por inúmeras empresas. Nos últimos anos, uma das soluções mais utilizadas por atacadistas de autosserviço são os sistemas ERP, uma ferramenta que centraliza e integra diversos processos de gestão financeira e operacional (</w:t>
           </w:r>
           <w:r>
             <w:rPr>
@@ -2482,13 +2485,7 @@
             <w:rPr>
               <w:rFonts w:cs="Arial"/>
             </w:rPr>
-            <w:t>, ou, traduzido para o português, Planejamento de Recursos Empresariais, permite uma visualização mais completa e unificada do negócio, possibilitando uma maior eficiência e assertividade na tomada de deci</w:t>
-          </w:r>
-          <w:r>
-            <w:rPr>
-              <w:rFonts w:cs="Arial"/>
-            </w:rPr>
-            <w:t>sões (</w:t>
+            <w:t>, ou, traduzido para o português, Planejamento de Recursos Empresariais, permite uma visualização mais completa e unificada do negócio, possibilitando uma maior eficiência e assertividade na tomada de decisões (</w:t>
           </w:r>
           <w:r>
             <w:rPr>
@@ -2677,19 +2674,7 @@
             <w:rPr>
               <w:rFonts w:cs="Arial"/>
             </w:rPr>
-            <w:t>. Essa junção de fatores faz com que o mínimo equívoco influencie expressivamen</w:t>
-          </w:r>
-          <w:r>
-            <w:rPr>
-              <w:rFonts w:cs="Arial"/>
-            </w:rPr>
-            <w:t>te na margem de ganho da empresa, de forma que, de acordo com o Sincovaga</w:t>
-          </w:r>
-          <w:r>
-            <w:rPr>
-              <w:rFonts w:cs="Arial"/>
-            </w:rPr>
-            <w:t>, a redução de perdas pela metade pode significar o triplo de lucro (</w:t>
+            <w:t>. Essa junção de fatores faz com que o mínimo equívoco influencie expressivamente na margem de ganho da empresa, de forma que, de acordo com o Sincovaga, a redução de perdas pela metade pode significar o triplo de lucro (</w:t>
           </w:r>
           <w:r>
             <w:rPr>
@@ -2728,13 +2713,7 @@
             <w:rPr>
               <w:rFonts w:cs="Arial"/>
             </w:rPr>
-            <w:t xml:space="preserve">Tendo isso em vista, é possível observar que existe uma lacuna na gestão de estoque em atacarejos, o que representa prejuízos financeiros significativos. Por conta disso, há espaço para que novas tecnologias e soluções surjam para auxiliar os processos já </w:t>
-          </w:r>
-          <w:r>
-            <w:rPr>
-              <w:rFonts w:cs="Arial"/>
-            </w:rPr>
-            <w:t xml:space="preserve">existentes e minimizar os desperdícios, potencializando o faturamento das </w:t>
+            <w:t xml:space="preserve">Tendo isso em vista, é possível observar que existe uma lacuna na gestão de estoque em atacarejos, o que representa prejuízos financeiros significativos. Por conta disso, há espaço para que novas tecnologias e soluções surjam para auxiliar os processos já existentes e minimizar os desperdícios, potencializando o faturamento das </w:t>
           </w:r>
           <w:r>
             <w:rPr>
@@ -2809,13 +2788,7 @@
             <w:rPr>
               <w:rFonts w:cs="Arial"/>
             </w:rPr>
-            <w:t>web, possibilitando a visualização da necessidade de reposição dos pr</w:t>
-          </w:r>
-          <w:r>
-            <w:rPr>
-              <w:rFonts w:cs="Arial"/>
-            </w:rPr>
-            <w:t>odutos e, assim, reduzir perdas e rupturas no setor atacadista de autosserviço, estimando elevar em 10% a eficiência de gestão de estoque.</w:t>
+            <w:t>web, possibilitando a visualização da necessidade de reposição dos produtos e, assim, reduzir perdas e rupturas no setor atacadista de autosserviço, estimando elevar em 10% a eficiência de gestão de estoque.</w:t>
           </w:r>
         </w:p>
         <w:p>
@@ -2899,15 +2872,7 @@
               <w:sz w:val="24"/>
               <w:szCs w:val="24"/>
             </w:rPr>
-            <w:t>web responsivo que apresente, de forma clara e em tem</w:t>
-          </w:r>
-          <w:r>
-            <w:rPr>
-              <w:rFonts w:cs="Arial"/>
-              <w:sz w:val="24"/>
-              <w:szCs w:val="24"/>
-            </w:rPr>
-            <w:t>po real,</w:t>
+            <w:t>web responsivo que apresente, de forma clara e em tempo real,</w:t>
           </w:r>
           <w:r>
             <w:rPr>
@@ -3113,15 +3078,7 @@
               <w:sz w:val="24"/>
               <w:szCs w:val="24"/>
             </w:rPr>
-            <w:t xml:space="preserve">Instalar sensores de forma individual em cada lote de produto, os sensores serão </w:t>
-          </w:r>
-          <w:r>
-            <w:rPr>
-              <w:rFonts w:eastAsia="Arial Nova" w:cs="Arial"/>
-              <w:sz w:val="24"/>
-              <w:szCs w:val="24"/>
-            </w:rPr>
-            <w:t>responsáveis por realizar a medição da distância e a partir dessas informações, informando a necessidade de repor ou não cada estoque.</w:t>
+            <w:t>Instalar sensores de forma individual em cada lote de produto, os sensores serão responsáveis por realizar a medição da distância e a partir dessas informações, informando a necessidade de repor ou não cada estoque.</w:t>
           </w:r>
         </w:p>
         <w:p>
@@ -3185,13 +3142,7 @@
             <w:rPr>
               <w:rFonts w:cs="Arial"/>
             </w:rPr>
-            <w:t xml:space="preserve">A gestão de estoque permite criar um ambiente com maior eficiência, além de permitir aumento do fluxo de </w:t>
-          </w:r>
-          <w:r>
-            <w:rPr>
-              <w:rFonts w:cs="Arial"/>
-            </w:rPr>
-            <w:t>caixa, redução de desperdício e melhora na tomada de decisão (</w:t>
+            <w:t>A gestão de estoque permite criar um ambiente com maior eficiência, além de permitir aumento do fluxo de caixa, redução de desperdício e melhora na tomada de decisão (</w:t>
           </w:r>
           <w:r>
             <w:rPr>
@@ -3275,13 +3226,7 @@
             <w:rPr>
               <w:rFonts w:cs="Arial"/>
             </w:rPr>
-            <w:t>impl</w:t>
-          </w:r>
-          <w:r>
-            <w:rPr>
-              <w:rFonts w:cs="Arial"/>
-            </w:rPr>
-            <w:t>ementação</w:t>
+            <w:t>implementação</w:t>
           </w:r>
           <w:r>
             <w:rPr>
@@ -3385,13 +3330,7 @@
             <w:rPr>
               <w:rFonts w:cs="Arial"/>
             </w:rPr>
-            <w:t xml:space="preserve">Dessa forma, há necessidade de otimizar o espaço de forma a obter </w:t>
-          </w:r>
-          <w:r>
-            <w:rPr>
-              <w:rFonts w:cs="Arial"/>
-            </w:rPr>
-            <w:t>eficiência na gestão de estoque dentro da organização, com base nas demandas do mercado e a visualização dos principais produtos a serem estocados.</w:t>
+            <w:t>Dessa forma, há necessidade de otimizar o espaço de forma a obter eficiência na gestão de estoque dentro da organização, com base nas demandas do mercado e a visualização dos principais produtos a serem estocados.</w:t>
           </w:r>
         </w:p>
         <w:p>
@@ -3537,13 +3476,7 @@
             <w:rPr>
               <w:rFonts w:cs="Arial"/>
             </w:rPr>
-            <w:t>Será desenvolvido um sistema web responsivo integrado a um Arduino Uno R3 com sensor ultrassônico (HC-SR04) com o objetivo de monitorar o nível de estoque em atacadistas de autosserviço. O sistema permitirá que usuários (gerentes, supervisores ou responsáv</w:t>
-          </w:r>
-          <w:r>
-            <w:rPr>
-              <w:rFonts w:cs="Arial"/>
-            </w:rPr>
-            <w:t xml:space="preserve">eis pelo estoque) acessem um </w:t>
+            <w:t xml:space="preserve">Será desenvolvido um sistema web responsivo integrado a um Arduino Uno R3 com sensor ultrassônico (HC-SR04) com o objetivo de monitorar o nível de estoque em atacadistas de autosserviço. O sistema permitirá que usuários (gerentes, supervisores ou responsáveis pelo estoque) acessem um </w:t>
           </w:r>
           <w:r>
             <w:rPr>
@@ -3693,15 +3626,7 @@
               <w:sz w:val="24"/>
               <w:szCs w:val="24"/>
             </w:rPr>
-            <w:t>Se</w:t>
-          </w:r>
-          <w:r>
-            <w:rPr>
-              <w:rFonts w:cs="Arial"/>
-              <w:sz w:val="24"/>
-              <w:szCs w:val="24"/>
-            </w:rPr>
-            <w:t>nsor</w:t>
+            <w:t>Sensor</w:t>
           </w:r>
           <w:r>
             <w:rPr>
@@ -4012,15 +3937,7 @@
               <w:sz w:val="24"/>
               <w:szCs w:val="24"/>
             </w:rPr>
-            <w:t xml:space="preserve">Banco de dados estruturado (MySQL): Armazenamento de dados </w:t>
-          </w:r>
-          <w:r>
-            <w:rPr>
-              <w:rFonts w:cs="Arial"/>
-              <w:sz w:val="24"/>
-              <w:szCs w:val="24"/>
-            </w:rPr>
-            <w:t>históricos das medições associados a produtos e horários.</w:t>
+            <w:t>Banco de dados estruturado (MySQL): Armazenamento de dados históricos das medições associados a produtos e horários.</w:t>
           </w:r>
         </w:p>
         <w:p>
@@ -4915,13 +4832,7 @@
             <w:rPr>
               <w:rFonts w:cs="Arial"/>
             </w:rPr>
-            <w:t xml:space="preserve">Os requisitos se </w:t>
-          </w:r>
-          <w:r>
-            <w:rPr>
-              <w:rFonts w:cs="Arial"/>
-            </w:rPr>
-            <w:t>referem aos pontos</w:t>
+            <w:t>Os requisitos se referem aos pontos</w:t>
           </w:r>
           <w:r>
             <w:rPr>
@@ -5231,16 +5142,7 @@
               <w:sz w:val="24"/>
               <w:szCs w:val="24"/>
             </w:rPr>
-            <w:t xml:space="preserve">do </w:t>
-          </w:r>
-          <w:r>
-            <w:rPr>
-              <w:rFonts w:cs="Arial"/>
-              <w:b/>
-              <w:sz w:val="24"/>
-              <w:szCs w:val="24"/>
-            </w:rPr>
-            <w:t>Projeto classificados em essencial, importante e desejável</w:t>
+            <w:t>do Projeto classificados em essencial, importante e desejável</w:t>
           </w:r>
           <w:r>
             <w:rPr>
@@ -5681,17 +5583,7 @@
               <w:sz w:val="24"/>
               <w:szCs w:val="24"/>
             </w:rPr>
-            <w:t xml:space="preserve"> Atas de dai</w:t>
-          </w:r>
-          <w:r>
-            <w:rPr>
-              <w:rFonts w:cs="Arial"/>
-              <w:b/>
-              <w:spacing w:val="-7"/>
-              <w:sz w:val="24"/>
-              <w:szCs w:val="24"/>
-            </w:rPr>
-            <w:t xml:space="preserve">ly, </w:t>
+            <w:t xml:space="preserve"> Atas de daily, </w:t>
           </w:r>
           <w:r>
             <w:rPr>
@@ -7124,7 +7016,7 @@
               <v:shape id="_x0000_i1025" type="#_x0000_t75" style="width:75.75pt;height:48.75pt" o:ole="">
                 <v:imagedata r:id="rId20" o:title=""/>
               </v:shape>
-              <o:OLEObject Type="Embed" ProgID="Package" ShapeID="_x0000_i1025" DrawAspect="Icon" ObjectID="_1826279134" r:id="rId21"/>
+              <o:OLEObject Type="Embed" ProgID="Package" ShapeID="_x0000_i1025" DrawAspect="Icon" ObjectID="_1826279672" r:id="rId21"/>
             </w:object>
           </w:r>
         </w:p>
@@ -7986,7 +7878,7 @@
               <v:shape id="_x0000_i1026" type="#_x0000_t75" style="width:75.75pt;height:48.75pt" o:ole="">
                 <v:imagedata r:id="rId25" o:title=""/>
               </v:shape>
-              <o:OLEObject Type="Embed" ProgID="Package" ShapeID="_x0000_i1026" DrawAspect="Icon" ObjectID="_1826279135" r:id="rId26"/>
+              <o:OLEObject Type="Embed" ProgID="Package" ShapeID="_x0000_i1026" DrawAspect="Icon" ObjectID="_1826279673" r:id="rId26"/>
             </w:object>
           </w:r>
         </w:p>
@@ -8287,7 +8179,7 @@
                   </wp:inline>
                 </w:drawing>
               </mc:Choice>
-              <mc:Fallback xmlns:w16sdtfl="http://schemas.microsoft.com/office/word/2024/wordml/sdtformatlock" xmlns:w16du="http://schemas.microsoft.com/office/word/2023/wordml/word16du" xmlns:oel="http://schemas.microsoft.com/office/2019/extlst">
+              <mc:Fallback xmlns:oel="http://schemas.microsoft.com/office/2019/extlst" xmlns:w16du="http://schemas.microsoft.com/office/word/2023/wordml/word16du" xmlns:w16sdtfl="http://schemas.microsoft.com/office/word/2024/wordml/sdtformatlock">
                 <w:pict>
                   <v:rect w14:anchorId="0E6012ED" id="AutoShape 9" o:spid="_x0000_s1026" alt="Visualização da imagem" style="width:24pt;height:24pt;visibility:visible;mso-wrap-style:square;mso-left-percent:-10001;mso-top-percent:-10001;mso-position-horizontal:absolute;mso-position-horizontal-relative:char;mso-position-vertical:absolute;mso-position-vertical-relative:line;mso-left-percent:-10001;mso-top-percent:-10001;v-text-anchor:top" o:gfxdata="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" filled="f" stroked="f">
                     <o:lock v:ext="edit" aspectratio="t"/>
@@ -8681,7 +8573,7 @@
                   </wp:inline>
                 </w:drawing>
               </mc:Choice>
-              <mc:Fallback xmlns:w16sdtfl="http://schemas.microsoft.com/office/word/2024/wordml/sdtformatlock" xmlns:w16du="http://schemas.microsoft.com/office/word/2023/wordml/word16du" xmlns:oel="http://schemas.microsoft.com/office/2019/extlst">
+              <mc:Fallback xmlns:oel="http://schemas.microsoft.com/office/2019/extlst" xmlns:w16du="http://schemas.microsoft.com/office/word/2023/wordml/word16du" xmlns:w16sdtfl="http://schemas.microsoft.com/office/word/2024/wordml/sdtformatlock">
                 <w:pict>
                   <v:rect w14:anchorId="0C9BB703" id="Retângulo 21" o:spid="_x0000_s1026" alt="Visualização da imagem" style="width:24pt;height:24pt;visibility:visible;mso-wrap-style:square;mso-left-percent:-10001;mso-top-percent:-10001;mso-position-horizontal:absolute;mso-position-horizontal-relative:char;mso-position-vertical:absolute;mso-position-vertical-relative:line;mso-left-percent:-10001;mso-top-percent:-10001;v-text-anchor:top" o:gfxdata="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" filled="f" stroked="f">
                     <o:lock v:ext="edit" aspectratio="t"/>
@@ -8878,13 +8770,7 @@
             <w:rPr>
               <w:rFonts w:cs="Arial"/>
             </w:rPr>
-            <w:t xml:space="preserve">Para delimitar os processos e atividades que serão </w:t>
-          </w:r>
-          <w:r>
-            <w:rPr>
-              <w:rFonts w:cs="Arial"/>
-            </w:rPr>
-            <w:t>realizadas e fornecidas no presente projeto, está descrito abaixo todos os itens a serem incluídos, tal como aqueles que não irão estar presentes no desenvolvimento e entrega do mesmo.</w:t>
+            <w:t>Para delimitar os processos e atividades que serão realizadas e fornecidas no presente projeto, está descrito abaixo todos os itens a serem incluídos, tal como aqueles que não irão estar presentes no desenvolvimento e entrega do mesmo.</w:t>
           </w:r>
         </w:p>
         <w:p>
@@ -9082,16 +8968,7 @@
               <w:sz w:val="24"/>
               <w:szCs w:val="24"/>
             </w:rPr>
-            <w:t>autosse</w:t>
-          </w:r>
-          <w:r>
-            <w:rPr>
-              <w:rFonts w:cs="Arial"/>
-              <w:spacing w:val="-2"/>
-              <w:sz w:val="24"/>
-              <w:szCs w:val="24"/>
-            </w:rPr>
-            <w:t>rviço.</w:t>
+            <w:t>autosserviço.</w:t>
           </w:r>
         </w:p>
         <w:p>
@@ -11676,13 +11553,7 @@
             <w:rPr>
               <w:rFonts w:cs="Arial"/>
             </w:rPr>
-            <w:t xml:space="preserve">O </w:t>
-          </w:r>
-          <w:r>
-            <w:rPr>
-              <w:rFonts w:cs="Arial"/>
-            </w:rPr>
-            <w:t>cronograma para o projeto está previsto conforme consta na Tabela 1, o qual indica os recursos a serem realizados e o tempo necessário para realizar as atividades.</w:t>
+            <w:t>O cronograma para o projeto está previsto conforme consta na Tabela 1, o qual indica os recursos a serem realizados e o tempo necessário para realizar as atividades.</w:t>
           </w:r>
         </w:p>
         <w:p>
@@ -12595,13 +12466,7 @@
         <w:rPr>
           <w:rFonts w:cs="Arial"/>
         </w:rPr>
-        <w:t xml:space="preserve">Os recursos necessários para que seja </w:t>
-      </w:r>
-      <w:r>
-        <w:rPr>
-          <w:rFonts w:cs="Arial"/>
-        </w:rPr>
-        <w:t>realizado o atual projeto estão inclusos</w:t>
+        <w:t>Os recursos necessários para que seja realizado o atual projeto estão inclusos</w:t>
       </w:r>
       <w:r>
         <w:rPr>
@@ -17886,15 +17751,7 @@
                 <w:sz w:val="24"/>
                 <w:szCs w:val="24"/>
               </w:rPr>
-              <w:t xml:space="preserve">e experiência do </w:t>
-            </w:r>
-            <w:r>
-              <w:rPr>
-                <w:rFonts w:cs="Arial"/>
-                <w:sz w:val="24"/>
-                <w:szCs w:val="24"/>
-              </w:rPr>
-              <w:t>usuário.</w:t>
+              <w:t>e experiência do usuário.</w:t>
             </w:r>
           </w:p>
         </w:tc>
@@ -19012,15 +18869,7 @@
           <w:sz w:val="24"/>
           <w:szCs w:val="24"/>
         </w:rPr>
-        <w:t>u</w:t>
-      </w:r>
-      <w:r>
-        <w:rPr>
-          <w:rFonts w:cs="Arial"/>
-          <w:sz w:val="24"/>
-          <w:szCs w:val="24"/>
-        </w:rPr>
-        <w:t>so</w:t>
+        <w:t>uso</w:t>
       </w:r>
       <w:r>
         <w:rPr>
@@ -19653,13 +19502,7 @@
         <w:rPr>
           <w:rFonts w:cs="Arial"/>
         </w:rPr>
-        <w:t xml:space="preserve">do </w:t>
-      </w:r>
-      <w:r>
-        <w:rPr>
-          <w:rFonts w:cs="Arial"/>
-        </w:rPr>
-        <w:t>projeto. Diante disso, as principais restrições do presente projeto são:</w:t>
+        <w:t>do projeto. Diante disso, as principais restrições do presente projeto são:</w:t>
       </w:r>
     </w:p>
     <w:p>
@@ -20072,15 +19915,7 @@
           <w:sz w:val="24"/>
           <w:szCs w:val="24"/>
         </w:rPr>
-        <w:t xml:space="preserve">por exemplo água, fontes de calor, </w:t>
-      </w:r>
-      <w:r>
-        <w:rPr>
-          <w:rFonts w:cs="Arial"/>
-          <w:sz w:val="24"/>
-          <w:szCs w:val="24"/>
-        </w:rPr>
-        <w:t>inflamáveis etc.</w:t>
+        <w:t>por exemplo água, fontes de calor, inflamáveis etc.</w:t>
       </w:r>
     </w:p>
     <w:p>
@@ -20912,14 +20747,7 @@
           <w:rFonts w:ascii="Arial MT" w:hAnsi="Arial MT"/>
           <w:spacing w:val="-5"/>
         </w:rPr>
-        <w:t xml:space="preserve"> </w:t>
-      </w:r>
-      <w:r>
-        <w:rPr>
-          <w:rFonts w:ascii="Arial MT" w:hAnsi="Arial MT"/>
-          <w:spacing w:val="-2"/>
-        </w:rPr>
-        <w:t>BIBLIOGRÁFICA</w:t>
+        <w:t>S</w:t>
       </w:r>
     </w:p>
     <w:p>
@@ -20985,15 +20813,7 @@
           <w:sz w:val="24"/>
           <w:szCs w:val="24"/>
         </w:rPr>
-        <w:t xml:space="preserve">. [S.I.]: Niq, 2025. Color. Disponível em: https://abaas.com.br/wp- </w:t>
-      </w:r>
-      <w:r>
-        <w:rPr>
-          <w:rFonts w:cs="Arial"/>
-          <w:sz w:val="24"/>
-          <w:szCs w:val="24"/>
-        </w:rPr>
-        <w:t>content/uploads/2025/04/Apresentacao-NielsenIQ_ABAAS_Marco-2025.pdf. Acesso</w:t>
+        <w:t>. [S.I.]: Niq, 2025. Color. Disponível em: https://abaas.com.br/wp- content/uploads/2025/04/Apresentacao-NielsenIQ_ABAAS_Marco-2025.pdf. Acesso</w:t>
       </w:r>
       <w:r>
         <w:rPr>
@@ -21089,14 +20909,7 @@
           <w:rFonts w:cs="Arial"/>
           <w:b/>
         </w:rPr>
-        <w:t>Z</w:t>
-      </w:r>
-      <w:r>
-        <w:rPr>
-          <w:rFonts w:cs="Arial"/>
-          <w:b/>
-        </w:rPr>
-        <w:t>enodo</w:t>
+        <w:t>Zenodo</w:t>
       </w:r>
       <w:r>
         <w:rPr>
@@ -21233,15 +21046,7 @@
           <w:sz w:val="24"/>
           <w:szCs w:val="24"/>
         </w:rPr>
-        <w:t>2025. Disponível em: https://cndl.org.br/varejosa</w:t>
-      </w:r>
-      <w:r>
-        <w:rPr>
-          <w:rFonts w:cs="Arial"/>
-          <w:sz w:val="24"/>
-          <w:szCs w:val="24"/>
-        </w:rPr>
-        <w:t>/por-que-os-sistemas-erp-estao-crescendo-no-brasil/. Acesso em: 05 set. 2025.</w:t>
+        <w:t>2025. Disponível em: https://cndl.org.br/varejosa/por-que-os-sistemas-erp-estao-crescendo-no-brasil/. Acesso em: 05 set. 2025.</w:t>
       </w:r>
     </w:p>
     <w:p>
@@ -21287,15 +21092,7 @@
           <w:sz w:val="24"/>
           <w:szCs w:val="24"/>
         </w:rPr>
-        <w:t>. 2024. Disponível em: https://dcomercio.com.br/publicacao/s/perdas- levam-para-o-lixo</w:t>
-      </w:r>
-      <w:r>
-        <w:rPr>
-          <w:rFonts w:cs="Arial"/>
-          <w:sz w:val="24"/>
-          <w:szCs w:val="24"/>
-        </w:rPr>
-        <w:t xml:space="preserve">-em-media-8-das-receitas-do-varejo-alimentar. Acesso em: 05 set. </w:t>
+        <w:t xml:space="preserve">. 2024. Disponível em: https://dcomercio.com.br/publicacao/s/perdas- levam-para-o-lixo-em-media-8-das-receitas-do-varejo-alimentar. Acesso em: 05 set. </w:t>
       </w:r>
       <w:r>
         <w:rPr>
@@ -21611,13 +21408,7 @@
         <w:rPr>
           <w:rFonts w:cs="Arial"/>
         </w:rPr>
-        <w:t>: eficiência e eco</w:t>
-      </w:r>
-      <w:r>
-        <w:rPr>
-          <w:rFonts w:cs="Arial"/>
-        </w:rPr>
-        <w:t>nomia. eficiência e economia. 2025. Disponível em: https://</w:t>
+        <w:t>: eficiência e economia. eficiência e economia. 2025. Disponível em: https://</w:t>
       </w:r>
       <w:hyperlink r:id="rId40">
         <w:r>
@@ -21664,14 +21455,7 @@
           <w:rFonts w:cs="Arial"/>
           <w:b/>
         </w:rPr>
-        <w:t xml:space="preserve">Principais tipos de perdas em </w:t>
-      </w:r>
-      <w:r>
-        <w:rPr>
-          <w:rFonts w:cs="Arial"/>
-          <w:b/>
-        </w:rPr>
-        <w:t xml:space="preserve">supermercados: </w:t>
+        <w:t xml:space="preserve">Principais tipos de perdas em supermercados: </w:t>
       </w:r>
       <w:r>
         <w:rPr>
@@ -21691,13 +21475,7 @@
         <w:rPr>
           <w:rFonts w:cs="Arial"/>
         </w:rPr>
-        <w:t xml:space="preserve"> perdas-em-supermercados-como-evitar. Acesso em: 05 set. 20</w:t>
-      </w:r>
-      <w:r>
-        <w:rPr>
-          <w:rFonts w:cs="Arial"/>
-        </w:rPr>
-        <w:t>25.</w:t>
+        <w:t xml:space="preserve"> perdas-em-supermercados-como-evitar. Acesso em: 05 set. 2025.</w:t>
       </w:r>
     </w:p>
     <w:sectPr>
@@ -21873,7 +21651,7 @@
             </wp:anchor>
           </w:drawing>
         </mc:Choice>
-        <mc:Fallback xmlns:w16sdtfl="http://schemas.microsoft.com/office/word/2024/wordml/sdtformatlock" xmlns:w16du="http://schemas.microsoft.com/office/word/2023/wordml/word16du" xmlns:oel="http://schemas.microsoft.com/office/2019/extlst">
+        <mc:Fallback xmlns:oel="http://schemas.microsoft.com/office/2019/extlst" xmlns:w16du="http://schemas.microsoft.com/office/word/2023/wordml/word16du" xmlns:w16sdtfl="http://schemas.microsoft.com/office/word/2024/wordml/sdtformatlock">
           <w:pict>
             <v:rect w14:anchorId="53BDF64C" id="Textbox 1" o:spid="_x0000_s1026" style="position:absolute;margin-left:546.95pt;margin-top:36.55pt;width:12.65pt;height:13.1pt;z-index:-251689472;visibility:visible;mso-wrap-style:square;mso-wrap-distance-left:0;mso-wrap-distance-top:0;mso-wrap-distance-right:0;mso-wrap-distance-bottom:0;mso-position-horizontal:absolute;mso-position-horizontal-relative:page;mso-position-vertical:absolute;mso-position-vertical-relative:page;v-text-anchor:top" o:gfxdata="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" filled="f" stroked="f">
               <v:textbox inset="0,0,0,0">
@@ -22063,7 +21841,7 @@
             </wp:anchor>
           </w:drawing>
         </mc:Choice>
-        <mc:Fallback xmlns:w16sdtfl="http://schemas.microsoft.com/office/word/2024/wordml/sdtformatlock" xmlns:w16du="http://schemas.microsoft.com/office/word/2023/wordml/word16du" xmlns:oel="http://schemas.microsoft.com/office/2019/extlst">
+        <mc:Fallback xmlns:oel="http://schemas.microsoft.com/office/2019/extlst" xmlns:w16du="http://schemas.microsoft.com/office/word/2023/wordml/word16du" xmlns:w16sdtfl="http://schemas.microsoft.com/office/word/2024/wordml/sdtformatlock">
           <w:pict>
             <v:rect w14:anchorId="467ECFC6" id="Textbox 10" o:spid="_x0000_s1035" style="position:absolute;margin-left:543.15pt;margin-top:36.55pt;width:16.35pt;height:13.1pt;z-index:-251633152;visibility:visible;mso-wrap-style:square;mso-wrap-distance-left:0;mso-wrap-distance-top:0;mso-wrap-distance-right:0;mso-wrap-distance-bottom:0;mso-position-horizontal:absolute;mso-position-horizontal-relative:page;mso-position-vertical:absolute;mso-position-vertical-relative:page;v-text-anchor:top" o:gfxdata="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" filled="f" stroked="f">
               <v:textbox inset="0,0,0,0">
@@ -22304,7 +22082,7 @@
             </wp:anchor>
           </w:drawing>
         </mc:Choice>
-        <mc:Fallback xmlns:w16sdtfl="http://schemas.microsoft.com/office/word/2024/wordml/sdtformatlock" xmlns:w16du="http://schemas.microsoft.com/office/word/2023/wordml/word16du" xmlns:oel="http://schemas.microsoft.com/office/2019/extlst">
+        <mc:Fallback xmlns:oel="http://schemas.microsoft.com/office/2019/extlst" xmlns:w16du="http://schemas.microsoft.com/office/word/2023/wordml/word16du" xmlns:w16sdtfl="http://schemas.microsoft.com/office/word/2024/wordml/sdtformatlock">
           <w:pict>
             <v:rect w14:anchorId="3A0C1A37" id="Textbox 11" o:spid="_x0000_s1036" style="position:absolute;margin-left:543.15pt;margin-top:36.55pt;width:16.35pt;height:13.1pt;z-index:-251632128;visibility:visible;mso-wrap-style:square;mso-wrap-distance-left:0;mso-wrap-distance-top:0;mso-wrap-distance-right:0;mso-wrap-distance-bottom:0;mso-position-horizontal:absolute;mso-position-horizontal-relative:page;mso-position-vertical:absolute;mso-position-vertical-relative:page;v-text-anchor:top" o:gfxdata="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" filled="f" stroked="f">
               <v:textbox inset="0,0,0,0">
@@ -22545,7 +22323,7 @@
             </wp:anchor>
           </w:drawing>
         </mc:Choice>
-        <mc:Fallback xmlns:w16sdtfl="http://schemas.microsoft.com/office/word/2024/wordml/sdtformatlock" xmlns:w16du="http://schemas.microsoft.com/office/word/2023/wordml/word16du" xmlns:oel="http://schemas.microsoft.com/office/2019/extlst">
+        <mc:Fallback xmlns:oel="http://schemas.microsoft.com/office/2019/extlst" xmlns:w16du="http://schemas.microsoft.com/office/word/2023/wordml/word16du" xmlns:w16sdtfl="http://schemas.microsoft.com/office/word/2024/wordml/sdtformatlock">
           <w:pict>
             <v:rect w14:anchorId="22B80A3C" id="Textbox 12" o:spid="_x0000_s1037" style="position:absolute;margin-left:543.15pt;margin-top:36.55pt;width:16.35pt;height:13.1pt;z-index:-251631104;visibility:visible;mso-wrap-style:square;mso-wrap-distance-left:0;mso-wrap-distance-top:0;mso-wrap-distance-right:0;mso-wrap-distance-bottom:0;mso-position-horizontal:absolute;mso-position-horizontal-relative:page;mso-position-vertical:absolute;mso-position-vertical-relative:page;v-text-anchor:top" o:gfxdata="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" filled="f" stroked="f">
               <v:textbox inset="0,0,0,0">
@@ -22786,7 +22564,7 @@
             </wp:anchor>
           </w:drawing>
         </mc:Choice>
-        <mc:Fallback xmlns:w16sdtfl="http://schemas.microsoft.com/office/word/2024/wordml/sdtformatlock" xmlns:w16du="http://schemas.microsoft.com/office/word/2023/wordml/word16du" xmlns:oel="http://schemas.microsoft.com/office/2019/extlst">
+        <mc:Fallback xmlns:oel="http://schemas.microsoft.com/office/2019/extlst" xmlns:w16du="http://schemas.microsoft.com/office/word/2023/wordml/word16du" xmlns:w16sdtfl="http://schemas.microsoft.com/office/word/2024/wordml/sdtformatlock">
           <w:pict>
             <v:rect w14:anchorId="41CF21E3" id="Textbox 13" o:spid="_x0000_s1038" style="position:absolute;margin-left:543.15pt;margin-top:36.55pt;width:16.35pt;height:13.1pt;z-index:-503316444;visibility:visible;mso-wrap-style:square;mso-wrap-distance-left:0;mso-wrap-distance-top:0;mso-wrap-distance-right:0;mso-wrap-distance-bottom:0;mso-position-horizontal:absolute;mso-position-horizontal-relative:page;mso-position-vertical:absolute;mso-position-vertical-relative:page;v-text-anchor:top" o:gfxdata="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" filled="f" stroked="f">
               <v:textbox inset="0,0,0,0">
@@ -23027,7 +22805,7 @@
             </wp:anchor>
           </w:drawing>
         </mc:Choice>
-        <mc:Fallback xmlns:w16sdtfl="http://schemas.microsoft.com/office/word/2024/wordml/sdtformatlock" xmlns:w16du="http://schemas.microsoft.com/office/word/2023/wordml/word16du" xmlns:oel="http://schemas.microsoft.com/office/2019/extlst">
+        <mc:Fallback xmlns:oel="http://schemas.microsoft.com/office/2019/extlst" xmlns:w16du="http://schemas.microsoft.com/office/word/2023/wordml/word16du" xmlns:w16sdtfl="http://schemas.microsoft.com/office/word/2024/wordml/sdtformatlock">
           <w:pict>
             <v:rect w14:anchorId="0D5A3CF9" id="Textbox 14" o:spid="_x0000_s1039" style="position:absolute;margin-left:543.15pt;margin-top:36.55pt;width:16.35pt;height:13.1pt;z-index:-503316443;visibility:visible;mso-wrap-style:square;mso-wrap-distance-left:0;mso-wrap-distance-top:0;mso-wrap-distance-right:0;mso-wrap-distance-bottom:0;mso-position-horizontal:absolute;mso-position-horizontal-relative:page;mso-position-vertical:absolute;mso-position-vertical-relative:page;v-text-anchor:top" o:gfxdata="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" filled="f" stroked="f">
               <v:textbox inset="0,0,0,0">
@@ -23268,7 +23046,7 @@
             </wp:anchor>
           </w:drawing>
         </mc:Choice>
-        <mc:Fallback xmlns:w16sdtfl="http://schemas.microsoft.com/office/word/2024/wordml/sdtformatlock" xmlns:w16du="http://schemas.microsoft.com/office/word/2023/wordml/word16du" xmlns:oel="http://schemas.microsoft.com/office/2019/extlst">
+        <mc:Fallback xmlns:oel="http://schemas.microsoft.com/office/2019/extlst" xmlns:w16du="http://schemas.microsoft.com/office/word/2023/wordml/word16du" xmlns:w16sdtfl="http://schemas.microsoft.com/office/word/2024/wordml/sdtformatlock">
           <w:pict>
             <v:rect w14:anchorId="172860A6" id="Textbox 3" o:spid="_x0000_s1027" style="position:absolute;margin-left:543.15pt;margin-top:36.55pt;width:16.35pt;height:13.1pt;z-index:-251686400;visibility:visible;mso-wrap-style:square;mso-wrap-distance-left:0;mso-wrap-distance-top:0;mso-wrap-distance-right:0;mso-wrap-distance-bottom:0;mso-position-horizontal:absolute;mso-position-horizontal-relative:page;mso-position-vertical:absolute;mso-position-vertical-relative:page;v-text-anchor:top" o:gfxdata="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" filled="f" stroked="f">
               <v:textbox inset="0,0,0,0">
@@ -23509,7 +23287,7 @@
             </wp:anchor>
           </w:drawing>
         </mc:Choice>
-        <mc:Fallback xmlns:w16sdtfl="http://schemas.microsoft.com/office/word/2024/wordml/sdtformatlock" xmlns:w16du="http://schemas.microsoft.com/office/word/2023/wordml/word16du" xmlns:oel="http://schemas.microsoft.com/office/2019/extlst">
+        <mc:Fallback xmlns:oel="http://schemas.microsoft.com/office/2019/extlst" xmlns:w16du="http://schemas.microsoft.com/office/word/2023/wordml/word16du" xmlns:w16sdtfl="http://schemas.microsoft.com/office/word/2024/wordml/sdtformatlock">
           <w:pict>
             <v:rect w14:anchorId="58669A5B" id="Textbox 2" o:spid="_x0000_s1028" style="position:absolute;margin-left:543.15pt;margin-top:36.55pt;width:16.35pt;height:13.1pt;z-index:-251685376;visibility:visible;mso-wrap-style:square;mso-wrap-distance-left:0;mso-wrap-distance-top:0;mso-wrap-distance-right:0;mso-wrap-distance-bottom:0;mso-position-horizontal:absolute;mso-position-horizontal-relative:page;mso-position-vertical:absolute;mso-position-vertical-relative:page;v-text-anchor:top" o:gfxdata="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" filled="f" stroked="f">
               <v:textbox inset="0,0,0,0">
@@ -23750,7 +23528,7 @@
             </wp:anchor>
           </w:drawing>
         </mc:Choice>
-        <mc:Fallback xmlns:w16sdtfl="http://schemas.microsoft.com/office/word/2024/wordml/sdtformatlock" xmlns:w16du="http://schemas.microsoft.com/office/word/2023/wordml/word16du" xmlns:oel="http://schemas.microsoft.com/office/2019/extlst">
+        <mc:Fallback xmlns:oel="http://schemas.microsoft.com/office/2019/extlst" xmlns:w16du="http://schemas.microsoft.com/office/word/2023/wordml/word16du" xmlns:w16sdtfl="http://schemas.microsoft.com/office/word/2024/wordml/sdtformatlock">
           <w:pict>
             <v:rect w14:anchorId="6C8E4423" id="Textbox 4" o:spid="_x0000_s1029" style="position:absolute;margin-left:543.15pt;margin-top:36.55pt;width:16.35pt;height:13.1pt;z-index:-251683328;visibility:visible;mso-wrap-style:square;mso-wrap-distance-left:0;mso-wrap-distance-top:0;mso-wrap-distance-right:0;mso-wrap-distance-bottom:0;mso-position-horizontal:absolute;mso-position-horizontal-relative:page;mso-position-vertical:absolute;mso-position-vertical-relative:page;v-text-anchor:top" o:gfxdata="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" filled="f" stroked="f">
               <v:textbox inset="0,0,0,0">
@@ -23991,7 +23769,7 @@
             </wp:anchor>
           </w:drawing>
         </mc:Choice>
-        <mc:Fallback xmlns:w16sdtfl="http://schemas.microsoft.com/office/word/2024/wordml/sdtformatlock" xmlns:w16du="http://schemas.microsoft.com/office/word/2023/wordml/word16du" xmlns:oel="http://schemas.microsoft.com/office/2019/extlst">
+        <mc:Fallback xmlns:oel="http://schemas.microsoft.com/office/2019/extlst" xmlns:w16du="http://schemas.microsoft.com/office/word/2023/wordml/word16du" xmlns:w16sdtfl="http://schemas.microsoft.com/office/word/2024/wordml/sdtformatlock">
           <w:pict>
             <v:rect w14:anchorId="0B0E73B5" id="Textbox 5" o:spid="_x0000_s1030" style="position:absolute;margin-left:543.15pt;margin-top:36.55pt;width:16.35pt;height:13.1pt;z-index:-251673088;visibility:visible;mso-wrap-style:square;mso-wrap-distance-left:0;mso-wrap-distance-top:0;mso-wrap-distance-right:0;mso-wrap-distance-bottom:0;mso-position-horizontal:absolute;mso-position-horizontal-relative:page;mso-position-vertical:absolute;mso-position-vertical-relative:page;v-text-anchor:top" o:gfxdata="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" filled="f" stroked="f">
               <v:textbox inset="0,0,0,0">
@@ -24232,7 +24010,7 @@
             </wp:anchor>
           </w:drawing>
         </mc:Choice>
-        <mc:Fallback xmlns:w16sdtfl="http://schemas.microsoft.com/office/word/2024/wordml/sdtformatlock" xmlns:w16du="http://schemas.microsoft.com/office/word/2023/wordml/word16du" xmlns:oel="http://schemas.microsoft.com/office/2019/extlst">
+        <mc:Fallback xmlns:oel="http://schemas.microsoft.com/office/2019/extlst" xmlns:w16du="http://schemas.microsoft.com/office/word/2023/wordml/word16du" xmlns:w16sdtfl="http://schemas.microsoft.com/office/word/2024/wordml/sdtformatlock">
           <w:pict>
             <v:rect w14:anchorId="2802F7FD" id="Textbox 6" o:spid="_x0000_s1031" style="position:absolute;margin-left:543.15pt;margin-top:36.55pt;width:16.35pt;height:13.1pt;z-index:-251652608;visibility:visible;mso-wrap-style:square;mso-wrap-distance-left:0;mso-wrap-distance-top:0;mso-wrap-distance-right:0;mso-wrap-distance-bottom:0;mso-position-horizontal:absolute;mso-position-horizontal-relative:page;mso-position-vertical:absolute;mso-position-vertical-relative:page;v-text-anchor:top" o:gfxdata="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" filled="f" stroked="f">
               <v:textbox inset="0,0,0,0">
@@ -24473,7 +24251,7 @@
             </wp:anchor>
           </w:drawing>
         </mc:Choice>
-        <mc:Fallback xmlns:w16sdtfl="http://schemas.microsoft.com/office/word/2024/wordml/sdtformatlock" xmlns:w16du="http://schemas.microsoft.com/office/word/2023/wordml/word16du" xmlns:oel="http://schemas.microsoft.com/office/2019/extlst">
+        <mc:Fallback xmlns:oel="http://schemas.microsoft.com/office/2019/extlst" xmlns:w16du="http://schemas.microsoft.com/office/word/2023/wordml/word16du" xmlns:w16sdtfl="http://schemas.microsoft.com/office/word/2024/wordml/sdtformatlock">
           <w:pict>
             <v:rect w14:anchorId="7B3673B5" id="Textbox 7" o:spid="_x0000_s1032" style="position:absolute;margin-left:543.15pt;margin-top:36.55pt;width:16.35pt;height:13.1pt;z-index:-251638272;visibility:visible;mso-wrap-style:square;mso-wrap-distance-left:0;mso-wrap-distance-top:0;mso-wrap-distance-right:0;mso-wrap-distance-bottom:0;mso-position-horizontal:absolute;mso-position-horizontal-relative:page;mso-position-vertical:absolute;mso-position-vertical-relative:page;v-text-anchor:top" o:gfxdata="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" filled="f" stroked="f">
               <v:textbox inset="0,0,0,0">
@@ -24714,7 +24492,7 @@
             </wp:anchor>
           </w:drawing>
         </mc:Choice>
-        <mc:Fallback xmlns:w16sdtfl="http://schemas.microsoft.com/office/word/2024/wordml/sdtformatlock" xmlns:w16du="http://schemas.microsoft.com/office/word/2023/wordml/word16du" xmlns:oel="http://schemas.microsoft.com/office/2019/extlst">
+        <mc:Fallback xmlns:oel="http://schemas.microsoft.com/office/2019/extlst" xmlns:w16du="http://schemas.microsoft.com/office/word/2023/wordml/word16du" xmlns:w16sdtfl="http://schemas.microsoft.com/office/word/2024/wordml/sdtformatlock">
           <w:pict>
             <v:rect w14:anchorId="6676EEB7" id="Textbox 8" o:spid="_x0000_s1033" style="position:absolute;margin-left:543.15pt;margin-top:36.55pt;width:16.35pt;height:13.1pt;z-index:-251636224;visibility:visible;mso-wrap-style:square;mso-wrap-distance-left:0;mso-wrap-distance-top:0;mso-wrap-distance-right:0;mso-wrap-distance-bottom:0;mso-position-horizontal:absolute;mso-position-horizontal-relative:page;mso-position-vertical:absolute;mso-position-vertical-relative:page;v-text-anchor:top" o:gfxdata="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" filled="f" stroked="f">
               <v:textbox inset="0,0,0,0">
@@ -24955,7 +24733,7 @@
             </wp:anchor>
           </w:drawing>
         </mc:Choice>
-        <mc:Fallback xmlns:w16sdtfl="http://schemas.microsoft.com/office/word/2024/wordml/sdtformatlock" xmlns:w16du="http://schemas.microsoft.com/office/word/2023/wordml/word16du" xmlns:oel="http://schemas.microsoft.com/office/2019/extlst">
+        <mc:Fallback xmlns:oel="http://schemas.microsoft.com/office/2019/extlst" xmlns:w16du="http://schemas.microsoft.com/office/word/2023/wordml/word16du" xmlns:w16sdtfl="http://schemas.microsoft.com/office/word/2024/wordml/sdtformatlock">
           <w:pict>
             <v:rect w14:anchorId="32534568" id="Textbox 9" o:spid="_x0000_s1034" style="position:absolute;margin-left:543.15pt;margin-top:36.55pt;width:16.35pt;height:13.1pt;z-index:-251634176;visibility:visible;mso-wrap-style:square;mso-wrap-distance-left:0;mso-wrap-distance-top:0;mso-wrap-distance-right:0;mso-wrap-distance-bottom:0;mso-position-horizontal:absolute;mso-position-horizontal-relative:page;mso-position-vertical:absolute;mso-position-vertical-relative:page;v-text-anchor:top" o:gfxdata="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" filled="f" stroked="f">
               <v:textbox inset="0,0,0,0">
@@ -26207,7 +25985,6 @@
   <w:style w:type="character" w:default="1" w:styleId="Fontepargpadro">
     <w:name w:val="Default Paragraph Font"/>
     <w:uiPriority w:val="1"/>
-    <w:semiHidden/>
     <w:unhideWhenUsed/>
   </w:style>
   <w:style w:type="table" w:default="1" w:styleId="Tabelanormal">

</xml_diff>